<commit_message>
docs: refresh midterm submission deliverables and formal specifications
</commit_message>
<xml_diff>
--- a/docs/submission/playIT_SPMP_v2.0.docx
+++ b/docs/submission/playIT_SPMP_v2.0.docx
@@ -12,7 +12,7 @@
           <w:noProof/>
         </w:rPr>
         <w:drawing>
-          <wp:inline distT="0" distB="0" distL="0" distR="0" wp14:anchorId="5E63DBD8" wp14:editId="37F5CF07">
+          <wp:inline distT="0" distB="0" distL="0" distR="0" wp14:anchorId="6566CF24" wp14:editId="34258E2B">
             <wp:extent cx="1463040" cy="1034415"/>
             <wp:effectExtent l="0" t="0" r="0" b="0"/>
             <wp:docPr id="1" name="Picture 1"/>
@@ -403,7 +403,7 @@
       <w:r>
         <w:fldChar w:fldCharType="separate"/>
       </w:r>
-      <w:hyperlink w:anchor="_Toc242912322" w:history="1">
+      <w:hyperlink w:anchor="_Toc243212139" w:history="1">
         <w:r>
           <w:rPr>
             <w:rStyle w:val="Hyperlink"/>
@@ -430,7 +430,7 @@
             <w:noProof/>
             <w:webHidden/>
           </w:rPr>
-          <w:instrText xml:space="preserve"> PAGEREF _Toc242912322 \h </w:instrText>
+          <w:instrText xml:space="preserve"> PAGEREF _Toc243212139 \h </w:instrText>
         </w:r>
         <w:r>
           <w:rPr>
@@ -478,7 +478,7 @@
           <w14:ligatures w14:val="standardContextual"/>
         </w:rPr>
       </w:pPr>
-      <w:hyperlink w:anchor="_Toc242912323" w:history="1">
+      <w:hyperlink w:anchor="_Toc243212140" w:history="1">
         <w:r>
           <w:rPr>
             <w:rStyle w:val="Hyperlink"/>
@@ -505,7 +505,7 @@
             <w:noProof/>
             <w:webHidden/>
           </w:rPr>
-          <w:instrText xml:space="preserve"> PAGEREF _Toc242912323 \h </w:instrText>
+          <w:instrText xml:space="preserve"> PAGEREF _Toc243212140 \h </w:instrText>
         </w:r>
         <w:r>
           <w:rPr>
@@ -553,7 +553,7 @@
           <w14:ligatures w14:val="standardContextual"/>
         </w:rPr>
       </w:pPr>
-      <w:hyperlink w:anchor="_Toc242912324" w:history="1">
+      <w:hyperlink w:anchor="_Toc243212141" w:history="1">
         <w:r>
           <w:rPr>
             <w:rStyle w:val="Hyperlink"/>
@@ -580,7 +580,7 @@
             <w:noProof/>
             <w:webHidden/>
           </w:rPr>
-          <w:instrText xml:space="preserve"> PAGEREF _Toc242912324 \h </w:instrText>
+          <w:instrText xml:space="preserve"> PAGEREF _Toc243212141 \h </w:instrText>
         </w:r>
         <w:r>
           <w:rPr>
@@ -628,7 +628,7 @@
           <w14:ligatures w14:val="standardContextual"/>
         </w:rPr>
       </w:pPr>
-      <w:hyperlink w:anchor="_Toc242912325" w:history="1">
+      <w:hyperlink w:anchor="_Toc243212142" w:history="1">
         <w:r>
           <w:rPr>
             <w:rStyle w:val="Hyperlink"/>
@@ -655,7 +655,7 @@
             <w:noProof/>
             <w:webHidden/>
           </w:rPr>
-          <w:instrText xml:space="preserve"> PAGEREF _Toc242912325 \h </w:instrText>
+          <w:instrText xml:space="preserve"> PAGEREF _Toc243212142 \h </w:instrText>
         </w:r>
         <w:r>
           <w:rPr>
@@ -703,7 +703,7 @@
           <w14:ligatures w14:val="standardContextual"/>
         </w:rPr>
       </w:pPr>
-      <w:hyperlink w:anchor="_Toc242912326" w:history="1">
+      <w:hyperlink w:anchor="_Toc243212143" w:history="1">
         <w:r>
           <w:rPr>
             <w:rStyle w:val="Hyperlink"/>
@@ -730,7 +730,7 @@
             <w:noProof/>
             <w:webHidden/>
           </w:rPr>
-          <w:instrText xml:space="preserve"> PAGEREF _Toc242912326 \h </w:instrText>
+          <w:instrText xml:space="preserve"> PAGEREF _Toc243212143 \h </w:instrText>
         </w:r>
         <w:r>
           <w:rPr>
@@ -778,7 +778,7 @@
           <w14:ligatures w14:val="standardContextual"/>
         </w:rPr>
       </w:pPr>
-      <w:hyperlink w:anchor="_Toc242912327" w:history="1">
+      <w:hyperlink w:anchor="_Toc243212144" w:history="1">
         <w:r>
           <w:rPr>
             <w:rStyle w:val="Hyperlink"/>
@@ -805,7 +805,7 @@
             <w:noProof/>
             <w:webHidden/>
           </w:rPr>
-          <w:instrText xml:space="preserve"> PAGEREF _Toc242912327 \h </w:instrText>
+          <w:instrText xml:space="preserve"> PAGEREF _Toc243212144 \h </w:instrText>
         </w:r>
         <w:r>
           <w:rPr>
@@ -853,7 +853,7 @@
           <w14:ligatures w14:val="standardContextual"/>
         </w:rPr>
       </w:pPr>
-      <w:hyperlink w:anchor="_Toc242912328" w:history="1">
+      <w:hyperlink w:anchor="_Toc243212145" w:history="1">
         <w:r>
           <w:rPr>
             <w:rStyle w:val="Hyperlink"/>
@@ -880,7 +880,7 @@
             <w:noProof/>
             <w:webHidden/>
           </w:rPr>
-          <w:instrText xml:space="preserve"> PAGEREF _Toc242912328 \h </w:instrText>
+          <w:instrText xml:space="preserve"> PAGEREF _Toc243212145 \h </w:instrText>
         </w:r>
         <w:r>
           <w:rPr>
@@ -928,7 +928,7 @@
           <w14:ligatures w14:val="standardContextual"/>
         </w:rPr>
       </w:pPr>
-      <w:hyperlink w:anchor="_Toc242912329" w:history="1">
+      <w:hyperlink w:anchor="_Toc243212146" w:history="1">
         <w:r>
           <w:rPr>
             <w:rStyle w:val="Hyperlink"/>
@@ -955,7 +955,7 @@
             <w:noProof/>
             <w:webHidden/>
           </w:rPr>
-          <w:instrText xml:space="preserve"> PAGEREF _Toc242912329 \h </w:instrText>
+          <w:instrText xml:space="preserve"> PAGEREF _Toc243212146 \h </w:instrText>
         </w:r>
         <w:r>
           <w:rPr>
@@ -1003,7 +1003,7 @@
           <w14:ligatures w14:val="standardContextual"/>
         </w:rPr>
       </w:pPr>
-      <w:hyperlink w:anchor="_Toc242912330" w:history="1">
+      <w:hyperlink w:anchor="_Toc243212147" w:history="1">
         <w:r>
           <w:rPr>
             <w:rStyle w:val="Hyperlink"/>
@@ -1030,7 +1030,7 @@
             <w:noProof/>
             <w:webHidden/>
           </w:rPr>
-          <w:instrText xml:space="preserve"> PAGEREF _Toc242912330 \h </w:instrText>
+          <w:instrText xml:space="preserve"> PAGEREF _Toc243212147 \h </w:instrText>
         </w:r>
         <w:r>
           <w:rPr>
@@ -1078,7 +1078,7 @@
           <w14:ligatures w14:val="standardContextual"/>
         </w:rPr>
       </w:pPr>
-      <w:hyperlink w:anchor="_Toc242912331" w:history="1">
+      <w:hyperlink w:anchor="_Toc243212148" w:history="1">
         <w:r>
           <w:rPr>
             <w:rStyle w:val="Hyperlink"/>
@@ -1105,7 +1105,7 @@
             <w:noProof/>
             <w:webHidden/>
           </w:rPr>
-          <w:instrText xml:space="preserve"> PAGEREF _Toc242912331 \h </w:instrText>
+          <w:instrText xml:space="preserve"> PAGEREF _Toc243212148 \h </w:instrText>
         </w:r>
         <w:r>
           <w:rPr>
@@ -1153,7 +1153,7 @@
           <w14:ligatures w14:val="standardContextual"/>
         </w:rPr>
       </w:pPr>
-      <w:hyperlink w:anchor="_Toc242912332" w:history="1">
+      <w:hyperlink w:anchor="_Toc243212149" w:history="1">
         <w:r>
           <w:rPr>
             <w:rStyle w:val="Hyperlink"/>
@@ -1180,7 +1180,7 @@
             <w:noProof/>
             <w:webHidden/>
           </w:rPr>
-          <w:instrText xml:space="preserve"> PAGEREF _Toc242912332 \h </w:instrText>
+          <w:instrText xml:space="preserve"> PAGEREF _Toc243212149 \h </w:instrText>
         </w:r>
         <w:r>
           <w:rPr>
@@ -1228,7 +1228,7 @@
           <w14:ligatures w14:val="standardContextual"/>
         </w:rPr>
       </w:pPr>
-      <w:hyperlink w:anchor="_Toc242912333" w:history="1">
+      <w:hyperlink w:anchor="_Toc243212150" w:history="1">
         <w:r>
           <w:rPr>
             <w:rStyle w:val="Hyperlink"/>
@@ -1255,7 +1255,7 @@
             <w:noProof/>
             <w:webHidden/>
           </w:rPr>
-          <w:instrText xml:space="preserve"> PAGEREF _Toc242912333 \h </w:instrText>
+          <w:instrText xml:space="preserve"> PAGEREF _Toc243212150 \h </w:instrText>
         </w:r>
         <w:r>
           <w:rPr>
@@ -1303,7 +1303,7 @@
           <w14:ligatures w14:val="standardContextual"/>
         </w:rPr>
       </w:pPr>
-      <w:hyperlink w:anchor="_Toc242912334" w:history="1">
+      <w:hyperlink w:anchor="_Toc243212151" w:history="1">
         <w:r>
           <w:rPr>
             <w:rStyle w:val="Hyperlink"/>
@@ -1330,7 +1330,7 @@
             <w:noProof/>
             <w:webHidden/>
           </w:rPr>
-          <w:instrText xml:space="preserve"> PAGEREF _Toc242912334 \h </w:instrText>
+          <w:instrText xml:space="preserve"> PAGEREF _Toc243212151 \h </w:instrText>
         </w:r>
         <w:r>
           <w:rPr>
@@ -1378,7 +1378,7 @@
           <w14:ligatures w14:val="standardContextual"/>
         </w:rPr>
       </w:pPr>
-      <w:hyperlink w:anchor="_Toc242912335" w:history="1">
+      <w:hyperlink w:anchor="_Toc243212152" w:history="1">
         <w:r>
           <w:rPr>
             <w:rStyle w:val="Hyperlink"/>
@@ -1405,7 +1405,7 @@
             <w:noProof/>
             <w:webHidden/>
           </w:rPr>
-          <w:instrText xml:space="preserve"> PAGEREF _Toc242912335 \h </w:instrText>
+          <w:instrText xml:space="preserve"> PAGEREF _Toc243212152 \h </w:instrText>
         </w:r>
         <w:r>
           <w:rPr>
@@ -1453,7 +1453,7 @@
           <w14:ligatures w14:val="standardContextual"/>
         </w:rPr>
       </w:pPr>
-      <w:hyperlink w:anchor="_Toc242912336" w:history="1">
+      <w:hyperlink w:anchor="_Toc243212153" w:history="1">
         <w:r>
           <w:rPr>
             <w:rStyle w:val="Hyperlink"/>
@@ -1480,7 +1480,7 @@
             <w:noProof/>
             <w:webHidden/>
           </w:rPr>
-          <w:instrText xml:space="preserve"> PAGEREF _Toc242912336 \h </w:instrText>
+          <w:instrText xml:space="preserve"> PAGEREF _Toc243212153 \h </w:instrText>
         </w:r>
         <w:r>
           <w:rPr>
@@ -1528,7 +1528,7 @@
           <w14:ligatures w14:val="standardContextual"/>
         </w:rPr>
       </w:pPr>
-      <w:hyperlink w:anchor="_Toc242912337" w:history="1">
+      <w:hyperlink w:anchor="_Toc243212154" w:history="1">
         <w:r>
           <w:rPr>
             <w:rStyle w:val="Hyperlink"/>
@@ -1555,7 +1555,7 @@
             <w:noProof/>
             <w:webHidden/>
           </w:rPr>
-          <w:instrText xml:space="preserve"> PAGEREF _Toc242912337 \h </w:instrText>
+          <w:instrText xml:space="preserve"> PAGEREF _Toc243212154 \h </w:instrText>
         </w:r>
         <w:r>
           <w:rPr>
@@ -1600,7 +1600,7 @@
       <w:pPr>
         <w:pStyle w:val="Heading1"/>
       </w:pPr>
-      <w:bookmarkStart w:id="0" w:name="_Toc242912322"/>
+      <w:bookmarkStart w:id="0" w:name="_Toc243212139"/>
       <w:r>
         <w:t>Document Revision History</w:t>
       </w:r>
@@ -1628,10 +1628,10 @@
         <w:tblLook w:val="04A0" w:firstRow="1" w:lastRow="0" w:firstColumn="1" w:lastColumn="0" w:noHBand="0" w:noVBand="1"/>
       </w:tblPr>
       <w:tblGrid>
-        <w:gridCol w:w="991"/>
-        <w:gridCol w:w="1239"/>
-        <w:gridCol w:w="2142"/>
-        <w:gridCol w:w="4988"/>
+        <w:gridCol w:w="992"/>
+        <w:gridCol w:w="1244"/>
+        <w:gridCol w:w="2069"/>
+        <w:gridCol w:w="5056"/>
       </w:tblGrid>
       <w:tr>
         <w:trPr>
@@ -1640,7 +1640,7 @@
         </w:trPr>
         <w:tc>
           <w:tcPr>
-            <w:tcW w:w="991" w:type="dxa"/>
+            <w:tcW w:w="992" w:type="dxa"/>
             <w:shd w:val="clear" w:color="auto" w:fill="1F3A3D"/>
           </w:tcPr>
           <w:p>
@@ -1660,7 +1660,7 @@
         </w:tc>
         <w:tc>
           <w:tcPr>
-            <w:tcW w:w="1239" w:type="dxa"/>
+            <w:tcW w:w="1244" w:type="dxa"/>
             <w:shd w:val="clear" w:color="auto" w:fill="1F3A3D"/>
           </w:tcPr>
           <w:p>
@@ -1680,7 +1680,7 @@
         </w:tc>
         <w:tc>
           <w:tcPr>
-            <w:tcW w:w="2142" w:type="dxa"/>
+            <w:tcW w:w="2069" w:type="dxa"/>
             <w:shd w:val="clear" w:color="auto" w:fill="1F3A3D"/>
           </w:tcPr>
           <w:p>
@@ -1700,7 +1700,7 @@
         </w:tc>
         <w:tc>
           <w:tcPr>
-            <w:tcW w:w="4988" w:type="dxa"/>
+            <w:tcW w:w="5056" w:type="dxa"/>
             <w:shd w:val="clear" w:color="auto" w:fill="1F3A3D"/>
           </w:tcPr>
           <w:p>
@@ -1725,7 +1725,7 @@
         </w:trPr>
         <w:tc>
           <w:tcPr>
-            <w:tcW w:w="991" w:type="dxa"/>
+            <w:tcW w:w="992" w:type="dxa"/>
           </w:tcPr>
           <w:p>
             <w:pPr>
@@ -1743,7 +1743,7 @@
         </w:tc>
         <w:tc>
           <w:tcPr>
-            <w:tcW w:w="1239" w:type="dxa"/>
+            <w:tcW w:w="1244" w:type="dxa"/>
           </w:tcPr>
           <w:p>
             <w:pPr>
@@ -1760,7 +1760,7 @@
         </w:tc>
         <w:tc>
           <w:tcPr>
-            <w:tcW w:w="2142" w:type="dxa"/>
+            <w:tcW w:w="2069" w:type="dxa"/>
           </w:tcPr>
           <w:p>
             <w:pPr>
@@ -1777,7 +1777,7 @@
         </w:tc>
         <w:tc>
           <w:tcPr>
-            <w:tcW w:w="4988" w:type="dxa"/>
+            <w:tcW w:w="5056" w:type="dxa"/>
           </w:tcPr>
           <w:p>
             <w:pPr>
@@ -1798,7 +1798,7 @@
         </w:trPr>
         <w:tc>
           <w:tcPr>
-            <w:tcW w:w="991" w:type="dxa"/>
+            <w:tcW w:w="992" w:type="dxa"/>
             <w:shd w:val="clear" w:color="auto" w:fill="F3F6F8"/>
           </w:tcPr>
           <w:p>
@@ -1817,7 +1817,7 @@
         </w:tc>
         <w:tc>
           <w:tcPr>
-            <w:tcW w:w="1239" w:type="dxa"/>
+            <w:tcW w:w="1244" w:type="dxa"/>
             <w:shd w:val="clear" w:color="auto" w:fill="F3F6F8"/>
           </w:tcPr>
           <w:p>
@@ -1835,7 +1835,7 @@
         </w:tc>
         <w:tc>
           <w:tcPr>
-            <w:tcW w:w="2142" w:type="dxa"/>
+            <w:tcW w:w="2069" w:type="dxa"/>
             <w:shd w:val="clear" w:color="auto" w:fill="F3F6F8"/>
           </w:tcPr>
           <w:p>
@@ -1853,7 +1853,7 @@
         </w:tc>
         <w:tc>
           <w:tcPr>
-            <w:tcW w:w="4988" w:type="dxa"/>
+            <w:tcW w:w="5056" w:type="dxa"/>
             <w:shd w:val="clear" w:color="auto" w:fill="F3F6F8"/>
           </w:tcPr>
           <w:p>
@@ -2022,7 +2022,7 @@
         </w:trPr>
         <w:tc>
           <w:tcPr>
-            <w:tcW w:w="991" w:type="dxa"/>
+            <w:tcW w:w="992" w:type="dxa"/>
           </w:tcPr>
           <w:p>
             <w:pPr>
@@ -2040,7 +2040,7 @@
         </w:tc>
         <w:tc>
           <w:tcPr>
-            <w:tcW w:w="1239" w:type="dxa"/>
+            <w:tcW w:w="1244" w:type="dxa"/>
           </w:tcPr>
           <w:p>
             <w:pPr>
@@ -2057,7 +2057,7 @@
         </w:tc>
         <w:tc>
           <w:tcPr>
-            <w:tcW w:w="2142" w:type="dxa"/>
+            <w:tcW w:w="2069" w:type="dxa"/>
           </w:tcPr>
           <w:p>
             <w:pPr>
@@ -2068,13 +2068,13 @@
               <w:rPr>
                 <w:sz w:val="17"/>
               </w:rPr>
-              <w:t>Capstone Team (Claude review)</w:t>
-            </w:r>
-          </w:p>
-        </w:tc>
-        <w:tc>
-          <w:tcPr>
-            <w:tcW w:w="4988" w:type="dxa"/>
+              <w:t>Capstone Team</w:t>
+            </w:r>
+          </w:p>
+        </w:tc>
+        <w:tc>
+          <w:tcPr>
+            <w:tcW w:w="5056" w:type="dxa"/>
           </w:tcPr>
           <w:p>
             <w:pPr>
@@ -2096,7 +2096,7 @@
         </w:trPr>
         <w:tc>
           <w:tcPr>
-            <w:tcW w:w="991" w:type="dxa"/>
+            <w:tcW w:w="992" w:type="dxa"/>
             <w:shd w:val="clear" w:color="auto" w:fill="F3F6F8"/>
           </w:tcPr>
           <w:p>
@@ -2115,7 +2115,7 @@
         </w:tc>
         <w:tc>
           <w:tcPr>
-            <w:tcW w:w="1239" w:type="dxa"/>
+            <w:tcW w:w="1244" w:type="dxa"/>
             <w:shd w:val="clear" w:color="auto" w:fill="F3F6F8"/>
           </w:tcPr>
           <w:p>
@@ -2133,7 +2133,7 @@
         </w:tc>
         <w:tc>
           <w:tcPr>
-            <w:tcW w:w="2142" w:type="dxa"/>
+            <w:tcW w:w="2069" w:type="dxa"/>
             <w:shd w:val="clear" w:color="auto" w:fill="F3F6F8"/>
           </w:tcPr>
           <w:p>
@@ -2145,13 +2145,13 @@
               <w:rPr>
                 <w:sz w:val="17"/>
               </w:rPr>
-              <w:t>Capstone Team (Claude, sprint synchronization)</w:t>
-            </w:r>
-          </w:p>
-        </w:tc>
-        <w:tc>
-          <w:tcPr>
-            <w:tcW w:w="4988" w:type="dxa"/>
+              <w:t>Capstone Team (sprint synchronization)</w:t>
+            </w:r>
+          </w:p>
+        </w:tc>
+        <w:tc>
+          <w:tcPr>
+            <w:tcW w:w="5056" w:type="dxa"/>
             <w:shd w:val="clear" w:color="auto" w:fill="F3F6F8"/>
           </w:tcPr>
           <w:p>
@@ -2216,7 +2216,7 @@
         </w:trPr>
         <w:tc>
           <w:tcPr>
-            <w:tcW w:w="991" w:type="dxa"/>
+            <w:tcW w:w="992" w:type="dxa"/>
           </w:tcPr>
           <w:p>
             <w:pPr>
@@ -2234,7 +2234,7 @@
         </w:tc>
         <w:tc>
           <w:tcPr>
-            <w:tcW w:w="1239" w:type="dxa"/>
+            <w:tcW w:w="1244" w:type="dxa"/>
           </w:tcPr>
           <w:p>
             <w:pPr>
@@ -2251,7 +2251,7 @@
         </w:tc>
         <w:tc>
           <w:tcPr>
-            <w:tcW w:w="2142" w:type="dxa"/>
+            <w:tcW w:w="2069" w:type="dxa"/>
           </w:tcPr>
           <w:p>
             <w:pPr>
@@ -2262,13 +2262,13 @@
               <w:rPr>
                 <w:sz w:val="17"/>
               </w:rPr>
-              <w:t>Capstone Team (Claude, submission review)</w:t>
-            </w:r>
-          </w:p>
-        </w:tc>
-        <w:tc>
-          <w:tcPr>
-            <w:tcW w:w="4988" w:type="dxa"/>
+              <w:t>Capstone Team (submission review)</w:t>
+            </w:r>
+          </w:p>
+        </w:tc>
+        <w:tc>
+          <w:tcPr>
+            <w:tcW w:w="5056" w:type="dxa"/>
           </w:tcPr>
           <w:p>
             <w:pPr>
@@ -2318,7 +2318,7 @@
         </w:trPr>
         <w:tc>
           <w:tcPr>
-            <w:tcW w:w="991" w:type="dxa"/>
+            <w:tcW w:w="992" w:type="dxa"/>
             <w:shd w:val="clear" w:color="auto" w:fill="F3F6F8"/>
           </w:tcPr>
           <w:p>
@@ -2337,7 +2337,7 @@
         </w:tc>
         <w:tc>
           <w:tcPr>
-            <w:tcW w:w="1239" w:type="dxa"/>
+            <w:tcW w:w="1244" w:type="dxa"/>
             <w:shd w:val="clear" w:color="auto" w:fill="F3F6F8"/>
           </w:tcPr>
           <w:p>
@@ -2355,7 +2355,7 @@
         </w:tc>
         <w:tc>
           <w:tcPr>
-            <w:tcW w:w="2142" w:type="dxa"/>
+            <w:tcW w:w="2069" w:type="dxa"/>
             <w:shd w:val="clear" w:color="auto" w:fill="F3F6F8"/>
           </w:tcPr>
           <w:p>
@@ -2373,7 +2373,7 @@
         </w:tc>
         <w:tc>
           <w:tcPr>
-            <w:tcW w:w="4988" w:type="dxa"/>
+            <w:tcW w:w="5056" w:type="dxa"/>
             <w:shd w:val="clear" w:color="auto" w:fill="F3F6F8"/>
           </w:tcPr>
           <w:p>
@@ -2396,7 +2396,7 @@
         </w:trPr>
         <w:tc>
           <w:tcPr>
-            <w:tcW w:w="991" w:type="dxa"/>
+            <w:tcW w:w="992" w:type="dxa"/>
           </w:tcPr>
           <w:p>
             <w:pPr>
@@ -2414,7 +2414,7 @@
         </w:tc>
         <w:tc>
           <w:tcPr>
-            <w:tcW w:w="1239" w:type="dxa"/>
+            <w:tcW w:w="1244" w:type="dxa"/>
           </w:tcPr>
           <w:p>
             <w:pPr>
@@ -2431,7 +2431,7 @@
         </w:tc>
         <w:tc>
           <w:tcPr>
-            <w:tcW w:w="2142" w:type="dxa"/>
+            <w:tcW w:w="2069" w:type="dxa"/>
           </w:tcPr>
           <w:p>
             <w:pPr>
@@ -2442,13 +2442,13 @@
               <w:rPr>
                 <w:sz w:val="17"/>
               </w:rPr>
-              <w:t>Capstone Team (Claude, card 30)</w:t>
-            </w:r>
-          </w:p>
-        </w:tc>
-        <w:tc>
-          <w:tcPr>
-            <w:tcW w:w="4988" w:type="dxa"/>
+              <w:t>Capstone Team (card 30)</w:t>
+            </w:r>
+          </w:p>
+        </w:tc>
+        <w:tc>
+          <w:tcPr>
+            <w:tcW w:w="5056" w:type="dxa"/>
           </w:tcPr>
           <w:p>
             <w:pPr>
@@ -2484,7 +2484,7 @@
         </w:trPr>
         <w:tc>
           <w:tcPr>
-            <w:tcW w:w="991" w:type="dxa"/>
+            <w:tcW w:w="992" w:type="dxa"/>
             <w:shd w:val="clear" w:color="auto" w:fill="F3F6F8"/>
           </w:tcPr>
           <w:p>
@@ -2503,7 +2503,7 @@
         </w:tc>
         <w:tc>
           <w:tcPr>
-            <w:tcW w:w="1239" w:type="dxa"/>
+            <w:tcW w:w="1244" w:type="dxa"/>
             <w:shd w:val="clear" w:color="auto" w:fill="F3F6F8"/>
           </w:tcPr>
           <w:p>
@@ -2521,7 +2521,7 @@
         </w:tc>
         <w:tc>
           <w:tcPr>
-            <w:tcW w:w="2142" w:type="dxa"/>
+            <w:tcW w:w="2069" w:type="dxa"/>
             <w:shd w:val="clear" w:color="auto" w:fill="F3F6F8"/>
           </w:tcPr>
           <w:p>
@@ -2533,13 +2533,13 @@
               <w:rPr>
                 <w:sz w:val="17"/>
               </w:rPr>
-              <w:t>Capstone Team (Claude, card 31)</w:t>
-            </w:r>
-          </w:p>
-        </w:tc>
-        <w:tc>
-          <w:tcPr>
-            <w:tcW w:w="4988" w:type="dxa"/>
+              <w:t>Capstone Team (card 31)</w:t>
+            </w:r>
+          </w:p>
+        </w:tc>
+        <w:tc>
+          <w:tcPr>
+            <w:tcW w:w="5056" w:type="dxa"/>
             <w:shd w:val="clear" w:color="auto" w:fill="F3F6F8"/>
           </w:tcPr>
           <w:p>
@@ -2579,7 +2579,7 @@
       <w:pPr>
         <w:pStyle w:val="Heading1"/>
       </w:pPr>
-      <w:bookmarkStart w:id="1" w:name="_Toc242912323"/>
+      <w:bookmarkStart w:id="1" w:name="_Toc243212140"/>
       <w:r>
         <w:t>1. Project Overview &amp; Scope Refactoring</w:t>
       </w:r>
@@ -2589,7 +2589,7 @@
       <w:pPr>
         <w:pStyle w:val="Heading2"/>
       </w:pPr>
-      <w:bookmarkStart w:id="2" w:name="_Toc242912324"/>
+      <w:bookmarkStart w:id="2" w:name="_Toc243212141"/>
       <w:r>
         <w:t>1.1 Project Purpose &amp; Executive Summary</w:t>
       </w:r>
@@ -2607,7 +2607,7 @@
       <w:pPr>
         <w:pStyle w:val="Heading2"/>
       </w:pPr>
-      <w:bookmarkStart w:id="3" w:name="_Toc242912325"/>
+      <w:bookmarkStart w:id="3" w:name="_Toc243212142"/>
       <w:r>
         <w:t>1.2 Interconnected Deliverables Traceability Baseline</w:t>
       </w:r>
@@ -3885,7 +3885,7 @@
       <w:pPr>
         <w:pStyle w:val="Heading2"/>
       </w:pPr>
-      <w:bookmarkStart w:id="4" w:name="_Toc242912326"/>
+      <w:bookmarkStart w:id="4" w:name="_Toc243212143"/>
       <w:r>
         <w:t>1.3 Scope Baseline &amp; Phased Implementation Strategy</w:t>
       </w:r>
@@ -3998,7 +3998,7 @@
       <w:pPr>
         <w:pStyle w:val="Heading1"/>
       </w:pPr>
-      <w:bookmarkStart w:id="5" w:name="_Toc242912327"/>
+      <w:bookmarkStart w:id="5" w:name="_Toc243212144"/>
       <w:r>
         <w:t>2. Work Breakdown Structure (WBS) &amp; Deliverables</w:t>
       </w:r>
@@ -4364,7 +4364,7 @@
       <w:pPr>
         <w:pStyle w:val="Heading1"/>
       </w:pPr>
-      <w:bookmarkStart w:id="6" w:name="_Toc242912328"/>
+      <w:bookmarkStart w:id="6" w:name="_Toc243212145"/>
       <w:r>
         <w:t>3. Activities, Milestones &amp; Revised Master Schedule</w:t>
       </w:r>
@@ -5861,7 +5861,7 @@
       <w:pPr>
         <w:pStyle w:val="Heading1"/>
       </w:pPr>
-      <w:bookmarkStart w:id="7" w:name="_Toc242912329"/>
+      <w:bookmarkStart w:id="7" w:name="_Toc243212146"/>
       <w:r>
         <w:t>4. Resource Allocation &amp; Infrastructure</w:t>
       </w:r>
@@ -5871,7 +5871,7 @@
       <w:pPr>
         <w:pStyle w:val="Heading2"/>
       </w:pPr>
-      <w:bookmarkStart w:id="8" w:name="_Toc242912330"/>
+      <w:bookmarkStart w:id="8" w:name="_Toc243212147"/>
       <w:r>
         <w:t>4.1 Development &amp; Processing Infrastructure</w:t>
       </w:r>
@@ -5953,7 +5953,7 @@
       <w:pPr>
         <w:pStyle w:val="Heading2"/>
       </w:pPr>
-      <w:bookmarkStart w:id="9" w:name="_Toc242912331"/>
+      <w:bookmarkStart w:id="9" w:name="_Toc243212148"/>
       <w:r>
         <w:t>4.2 Target Hardware &amp; Test Fleet</w:t>
       </w:r>
@@ -6011,7 +6011,7 @@
       <w:pPr>
         <w:pStyle w:val="Heading2"/>
       </w:pPr>
-      <w:bookmarkStart w:id="10" w:name="_Toc242912332"/>
+      <w:bookmarkStart w:id="10" w:name="_Toc243212149"/>
       <w:r>
         <w:t>4.3 Software Libraries &amp; Frameworks</w:t>
       </w:r>
@@ -6174,7 +6174,7 @@
       <w:pPr>
         <w:pStyle w:val="Heading1"/>
       </w:pPr>
-      <w:bookmarkStart w:id="11" w:name="_Toc242912333"/>
+      <w:bookmarkStart w:id="11" w:name="_Toc243212150"/>
       <w:r>
         <w:t>5. Team Roles and Responsibilities</w:t>
       </w:r>
@@ -6793,7 +6793,7 @@
       <w:pPr>
         <w:pStyle w:val="Heading1"/>
       </w:pPr>
-      <w:bookmarkStart w:id="12" w:name="_Toc242912334"/>
+      <w:bookmarkStart w:id="12" w:name="_Toc243212151"/>
       <w:r>
         <w:t>6. Comprehensive Risk Management &amp; Mitigation Matrix</w:t>
       </w:r>
@@ -8263,7 +8263,7 @@
       <w:pPr>
         <w:pStyle w:val="Heading1"/>
       </w:pPr>
-      <w:bookmarkStart w:id="13" w:name="_Toc242912335"/>
+      <w:bookmarkStart w:id="13" w:name="_Toc243212152"/>
       <w:r>
         <w:t>7. Configuration Management &amp; Quality Assurance</w:t>
       </w:r>
@@ -8273,7 +8273,7 @@
       <w:pPr>
         <w:pStyle w:val="Heading2"/>
       </w:pPr>
-      <w:bookmarkStart w:id="14" w:name="_Toc242912336"/>
+      <w:bookmarkStart w:id="14" w:name="_Toc243212153"/>
       <w:r>
         <w:t>7.1 Configuration Management &amp; Asset Versioning</w:t>
       </w:r>
@@ -8456,7 +8456,7 @@
       <w:pPr>
         <w:pStyle w:val="Heading2"/>
       </w:pPr>
-      <w:bookmarkStart w:id="15" w:name="_Toc242912337"/>
+      <w:bookmarkStart w:id="15" w:name="_Toc243212154"/>
       <w:r>
         <w:t>7.2 Quality Assurance &amp; Verification Protocol</w:t>
       </w:r>
@@ -8963,31 +8963,31 @@
       </w:rPr>
     </w:lvl>
   </w:abstractNum>
-  <w:num w:numId="1" w16cid:durableId="597257872">
+  <w:num w:numId="1" w16cid:durableId="372315317">
     <w:abstractNumId w:val="8"/>
   </w:num>
-  <w:num w:numId="2" w16cid:durableId="18899581">
+  <w:num w:numId="2" w16cid:durableId="380523537">
     <w:abstractNumId w:val="6"/>
   </w:num>
-  <w:num w:numId="3" w16cid:durableId="374237733">
+  <w:num w:numId="3" w16cid:durableId="516502181">
     <w:abstractNumId w:val="5"/>
   </w:num>
-  <w:num w:numId="4" w16cid:durableId="1219589570">
+  <w:num w:numId="4" w16cid:durableId="696929511">
     <w:abstractNumId w:val="4"/>
   </w:num>
-  <w:num w:numId="5" w16cid:durableId="1277564023">
+  <w:num w:numId="5" w16cid:durableId="374623542">
     <w:abstractNumId w:val="7"/>
   </w:num>
-  <w:num w:numId="6" w16cid:durableId="1491679493">
+  <w:num w:numId="6" w16cid:durableId="1223834963">
     <w:abstractNumId w:val="3"/>
   </w:num>
-  <w:num w:numId="7" w16cid:durableId="888415318">
+  <w:num w:numId="7" w16cid:durableId="871503366">
     <w:abstractNumId w:val="2"/>
   </w:num>
-  <w:num w:numId="8" w16cid:durableId="1560171074">
+  <w:num w:numId="8" w16cid:durableId="751395715">
     <w:abstractNumId w:val="1"/>
   </w:num>
-  <w:num w:numId="9" w16cid:durableId="403334792">
+  <w:num w:numId="9" w16cid:durableId="1411731773">
     <w:abstractNumId w:val="0"/>
   </w:num>
 </w:numbering>
@@ -20382,7 +20382,7 @@
     <w:autoRedefine/>
     <w:uiPriority w:val="39"/>
     <w:unhideWhenUsed/>
-    <w:rsid w:val="00E10879"/>
+    <w:rsid w:val="00562659"/>
     <w:pPr>
       <w:spacing w:after="100"/>
     </w:pPr>
@@ -20394,7 +20394,7 @@
     <w:autoRedefine/>
     <w:uiPriority w:val="39"/>
     <w:unhideWhenUsed/>
-    <w:rsid w:val="00E10879"/>
+    <w:rsid w:val="00562659"/>
     <w:pPr>
       <w:spacing w:after="100"/>
       <w:ind w:left="200"/>
@@ -20405,7 +20405,7 @@
     <w:basedOn w:val="DefaultParagraphFont"/>
     <w:uiPriority w:val="99"/>
     <w:unhideWhenUsed/>
-    <w:rsid w:val="00E10879"/>
+    <w:rsid w:val="00562659"/>
     <w:rPr>
       <w:color w:val="0000FF" w:themeColor="hyperlink"/>
       <w:u w:val="single"/>

</xml_diff>